<commit_message>
docs: weekly check-in assignments + Mon/Tue timeline (GO-TO-MARKET)
Co-Authored-By: Claude Opus 4.8 <noreply@anthropic.com>
</commit_message>
<xml_diff>
--- a/docs/GO-TO-MARKET.docx
+++ b/docs/GO-TO-MARKET.docx
@@ -2,7 +2,7 @@
 <file path=word/document.xml><?xml version="1.0" encoding="utf-8"?>
 <w:document xmlns:w="http://schemas.openxmlformats.org/wordprocessingml/2006/main" xmlns:m="http://schemas.openxmlformats.org/officeDocument/2006/math" xmlns:r="http://schemas.openxmlformats.org/officeDocument/2006/relationships" xmlns:o="urn:schemas-microsoft-com:office:office" xmlns:v="urn:schemas-microsoft-com:vml" xmlns:w10="urn:schemas-microsoft-com:office:word" xmlns:a="http://schemas.openxmlformats.org/drawingml/2006/main" xmlns:pic="http://schemas.openxmlformats.org/drawingml/2006/picture" xmlns:wp="http://schemas.openxmlformats.org/drawingml/2006/wordprocessingDrawing">
   <w:body>
-    <w:bookmarkStart w:id="21" w:name="X6ac925aa70c40fde5339a4441ad487219c0a603"/>
+    <w:bookmarkStart w:id="26" w:name="X6ac925aa70c40fde5339a4441ad487219c0a603"/>
     <w:p>
       <w:pPr>
         <w:pStyle w:val="Heading1"/>
@@ -428,13 +428,76 @@
       </w:r>
     </w:p>
     <w:bookmarkEnd w:id="9"/>
-    <w:bookmarkStart w:id="10" w:name="Xcf17b8baba9cc569637a09a0b3643be44f8ff9d"/>
+    <w:bookmarkStart w:id="14" w:name="X49619a2e1ee7c41db808985550825a83cfc8ad7"/>
     <w:p>
       <w:pPr>
         <w:pStyle w:val="Heading2"/>
       </w:pPr>
       <w:r>
-        <w:t xml:space="preserve">Near-term: test the setup at the next meeting</w:t>
+        <w:t xml:space="preserve">Weekly update — 2026-06-26: assignments &amp; next-week targets</w:t>
+      </w:r>
+    </w:p>
+    <w:p>
+      <w:pPr>
+        <w:pStyle w:val="FirstParagraph"/>
+      </w:pPr>
+      <w:r>
+        <w:t xml:space="preserve">Locked at today’s check-in.</w:t>
+      </w:r>
+      <w:r>
+        <w:t xml:space="preserve"> </w:t>
+      </w:r>
+      <w:r>
+        <w:rPr>
+          <w:b/>
+          <w:bCs/>
+        </w:rPr>
+        <w:t xml:space="preserve">Pricing</w:t>
+      </w:r>
+      <w:r>
+        <w:t xml:space="preserve"> </w:t>
+      </w:r>
+      <w:r>
+        <w:t xml:space="preserve">discussion deferred to the next meeting (Miguel to</w:t>
+      </w:r>
+      <w:r>
+        <w:t xml:space="preserve"> </w:t>
+      </w:r>
+      <w:r>
+        <w:t xml:space="preserve">prep a pricing to-do list).</w:t>
+      </w:r>
+    </w:p>
+    <w:p>
+      <w:pPr>
+        <w:pStyle w:val="BodyText"/>
+      </w:pPr>
+      <w:r>
+        <w:rPr>
+          <w:b/>
+          <w:bCs/>
+        </w:rPr>
+        <w:t xml:space="preserve">Decision pending — parent company name:</w:t>
+      </w:r>
+      <w:r>
+        <w:t xml:space="preserve"> </w:t>
+      </w:r>
+      <w:r>
+        <w:t xml:space="preserve">everyone brainstorms today and posts ideas in the</w:t>
+      </w:r>
+      <w:r>
+        <w:t xml:space="preserve"> </w:t>
+      </w:r>
+      <w:r>
+        <w:t xml:space="preserve">WhatsApp group, then we vote on the best. Needed before incorporation can be filed.</w:t>
+      </w:r>
+    </w:p>
+    <w:bookmarkStart w:id="10" w:name="abdul"/>
+    <w:p>
+      <w:pPr>
+        <w:pStyle w:val="Heading3"/>
+      </w:pPr>
+      <w:r>
+        <w:t xml:space="preserve">Abdul</w:t>
       </w:r>
     </w:p>
     <w:p>
@@ -450,6 +513,401 @@
           <w:b/>
           <w:bCs/>
         </w:rPr>
+        <w:t xml:space="preserve">Lead the incorporation process</w:t>
+      </w:r>
+      <w:r>
+        <w:t xml:space="preserve"> </w:t>
+      </w:r>
+      <w:r>
+        <w:t xml:space="preserve">— finalize details</w:t>
+      </w:r>
+      <w:r>
+        <w:t xml:space="preserve"> </w:t>
+      </w:r>
+      <w:r>
+        <w:rPr>
+          <w:b/>
+          <w:bCs/>
+        </w:rPr>
+        <w:t xml:space="preserve">Monday</w:t>
+      </w:r>
+      <w:r>
+        <w:t xml:space="preserve">,</w:t>
+      </w:r>
+      <w:r>
+        <w:t xml:space="preserve"> </w:t>
+      </w:r>
+      <w:r>
+        <w:rPr>
+          <w:b/>
+          <w:bCs/>
+        </w:rPr>
+        <w:t xml:space="preserve">completion target Tuesday</w:t>
+      </w:r>
+      <w:r>
+        <w:t xml:space="preserve">.</w:t>
+      </w:r>
+    </w:p>
+    <w:p>
+      <w:pPr>
+        <w:pStyle w:val="Compact"/>
+        <w:numPr>
+          <w:ilvl w:val="0"/>
+          <w:numId w:val="1001"/>
+        </w:numPr>
+      </w:pPr>
+      <w:r>
+        <w:rPr>
+          <w:b/>
+          <w:bCs/>
+        </w:rPr>
+        <w:t xml:space="preserve">Register the product trade name</w:t>
+      </w:r>
+      <w:r>
+        <w:t xml:space="preserve"> </w:t>
+      </w:r>
+      <w:r>
+        <w:t xml:space="preserve">(Bengal/Dispango — confirm exact brand) under the parent corp.</w:t>
+      </w:r>
+    </w:p>
+    <w:p>
+      <w:pPr>
+        <w:pStyle w:val="Compact"/>
+        <w:numPr>
+          <w:ilvl w:val="0"/>
+          <w:numId w:val="1001"/>
+        </w:numPr>
+      </w:pPr>
+      <w:r>
+        <w:rPr>
+          <w:b/>
+          <w:bCs/>
+        </w:rPr>
+        <w:t xml:space="preserve">Integrate the monitoring dashboard into the admin UI</w:t>
+      </w:r>
+      <w:r>
+        <w:t xml:space="preserve"> </w:t>
+      </w:r>
+      <w:r>
+        <w:t xml:space="preserve">— surface health/heartbeat + the</w:t>
+      </w:r>
+      <w:r>
+        <w:t xml:space="preserve"> </w:t>
+      </w:r>
+      <w:r>
+        <w:t xml:space="preserve">caller-ban controls inside the admin tool.</w:t>
+      </w:r>
+    </w:p>
+    <w:p>
+      <w:pPr>
+        <w:pStyle w:val="Compact"/>
+        <w:numPr>
+          <w:ilvl w:val="0"/>
+          <w:numId w:val="1001"/>
+        </w:numPr>
+      </w:pPr>
+      <w:r>
+        <w:rPr>
+          <w:b/>
+          <w:bCs/>
+        </w:rPr>
+        <w:t xml:space="preserve">Refine the demo deck / demo pitch.</w:t>
+      </w:r>
+    </w:p>
+    <w:bookmarkEnd w:id="10"/>
+    <w:bookmarkStart w:id="11" w:name="miguel"/>
+    <w:p>
+      <w:pPr>
+        <w:pStyle w:val="Heading3"/>
+      </w:pPr>
+      <w:r>
+        <w:t xml:space="preserve">Miguel</w:t>
+      </w:r>
+    </w:p>
+    <w:p>
+      <w:pPr>
+        <w:pStyle w:val="Compact"/>
+        <w:numPr>
+          <w:ilvl w:val="0"/>
+          <w:numId w:val="1002"/>
+        </w:numPr>
+      </w:pPr>
+      <w:r>
+        <w:rPr>
+          <w:b/>
+          <w:bCs/>
+        </w:rPr>
+        <w:t xml:space="preserve">Insurance</w:t>
+      </w:r>
+      <w:r>
+        <w:t xml:space="preserve"> </w:t>
+      </w:r>
+      <w:r>
+        <w:t xml:space="preserve">— find</w:t>
+      </w:r>
+      <w:r>
+        <w:t xml:space="preserve"> </w:t>
+      </w:r>
+      <w:r>
+        <w:rPr>
+          <w:b/>
+          <w:bCs/>
+        </w:rPr>
+        <w:t xml:space="preserve">general liability + errors &amp; omissions (E&amp;O)</w:t>
+      </w:r>
+      <w:r>
+        <w:t xml:space="preserve"> </w:t>
+      </w:r>
+      <w:r>
+        <w:t xml:space="preserve">options;</w:t>
+      </w:r>
+      <w:r>
+        <w:t xml:space="preserve"> </w:t>
+      </w:r>
+      <w:r>
+        <w:rPr>
+          <w:b/>
+          <w:bCs/>
+        </w:rPr>
+        <w:t xml:space="preserve">present</w:t>
+      </w:r>
+      <w:r>
+        <w:rPr>
+          <w:b/>
+          <w:bCs/>
+        </w:rPr>
+        <w:t xml:space="preserve"> </w:t>
+      </w:r>
+      <w:r>
+        <w:rPr>
+          <w:b/>
+          <w:bCs/>
+        </w:rPr>
+        <w:t xml:space="preserve">findings Monday</w:t>
+      </w:r>
+      <w:r>
+        <w:t xml:space="preserve"> </w:t>
+      </w:r>
+      <w:r>
+        <w:t xml:space="preserve">for the team to pick one and get a quote.</w:t>
+      </w:r>
+    </w:p>
+    <w:p>
+      <w:pPr>
+        <w:pStyle w:val="Compact"/>
+        <w:numPr>
+          <w:ilvl w:val="0"/>
+          <w:numId w:val="1002"/>
+        </w:numPr>
+      </w:pPr>
+      <w:r>
+        <w:rPr>
+          <w:b/>
+          <w:bCs/>
+        </w:rPr>
+        <w:t xml:space="preserve">Post-payment landing page</w:t>
+      </w:r>
+      <w:r>
+        <w:t xml:space="preserve"> </w:t>
+      </w:r>
+      <w:r>
+        <w:t xml:space="preserve">+</w:t>
+      </w:r>
+      <w:r>
+        <w:t xml:space="preserve"> </w:t>
+      </w:r>
+      <w:r>
+        <w:rPr>
+          <w:b/>
+          <w:bCs/>
+        </w:rPr>
+        <w:t xml:space="preserve">sales workflow</w:t>
+      </w:r>
+      <w:r>
+        <w:t xml:space="preserve"> </w:t>
+      </w:r>
+      <w:r>
+        <w:t xml:space="preserve">build.</w:t>
+      </w:r>
+    </w:p>
+    <w:p>
+      <w:pPr>
+        <w:pStyle w:val="Compact"/>
+        <w:numPr>
+          <w:ilvl w:val="0"/>
+          <w:numId w:val="1002"/>
+        </w:numPr>
+      </w:pPr>
+      <w:r>
+        <w:rPr>
+          <w:b/>
+          <w:bCs/>
+        </w:rPr>
+        <w:t xml:space="preserve">Pricing</w:t>
+      </w:r>
+      <w:r>
+        <w:t xml:space="preserve"> </w:t>
+      </w:r>
+      <w:r>
+        <w:t xml:space="preserve">— prep the to-do list for the next meeting.</w:t>
+      </w:r>
+    </w:p>
+    <w:bookmarkEnd w:id="11"/>
+    <w:bookmarkStart w:id="12" w:name="jordan"/>
+    <w:p>
+      <w:pPr>
+        <w:pStyle w:val="Heading3"/>
+      </w:pPr>
+      <w:r>
+        <w:t xml:space="preserve">Jordan</w:t>
+      </w:r>
+    </w:p>
+    <w:p>
+      <w:pPr>
+        <w:pStyle w:val="Compact"/>
+        <w:numPr>
+          <w:ilvl w:val="0"/>
+          <w:numId w:val="1003"/>
+        </w:numPr>
+      </w:pPr>
+      <w:r>
+        <w:rPr>
+          <w:b/>
+          <w:bCs/>
+        </w:rPr>
+        <w:t xml:space="preserve">Cold-call sales pitch</w:t>
+      </w:r>
+      <w:r>
+        <w:t xml:space="preserve"> </w:t>
+      </w:r>
+      <w:r>
+        <w:t xml:space="preserve">(taken over from Abdul; draft in</w:t>
+      </w:r>
+      <w:r>
+        <w:t xml:space="preserve"> </w:t>
+      </w:r>
+      <w:r>
+        <w:rPr>
+          <w:rStyle w:val="VerbatimChar"/>
+        </w:rPr>
+        <w:t xml:space="preserve">sales/cold-call-pitch.md</w:t>
+      </w:r>
+      <w:r>
+        <w:t xml:space="preserve">).</w:t>
+      </w:r>
+    </w:p>
+    <w:p>
+      <w:pPr>
+        <w:pStyle w:val="Compact"/>
+        <w:numPr>
+          <w:ilvl w:val="0"/>
+          <w:numId w:val="1003"/>
+        </w:numPr>
+      </w:pPr>
+      <w:r>
+        <w:rPr>
+          <w:b/>
+          <w:bCs/>
+        </w:rPr>
+        <w:t xml:space="preserve">Onboarding walkthrough</w:t>
+      </w:r>
+      <w:r>
+        <w:t xml:space="preserve"> </w:t>
+      </w:r>
+      <w:r>
+        <w:t xml:space="preserve">— Monday, the team goes step-by-step through the onboarding</w:t>
+      </w:r>
+      <w:r>
+        <w:t xml:space="preserve"> </w:t>
+      </w:r>
+      <w:r>
+        <w:t xml:space="preserve">process with Jordan (pushed from today).</w:t>
+      </w:r>
+    </w:p>
+    <w:bookmarkEnd w:id="12"/>
+    <w:bookmarkStart w:id="13" w:name="this-week-timeline"/>
+    <w:p>
+      <w:pPr>
+        <w:pStyle w:val="Heading3"/>
+      </w:pPr>
+      <w:r>
+        <w:t xml:space="preserve">This-week timeline</w:t>
+      </w:r>
+    </w:p>
+    <w:p>
+      <w:pPr>
+        <w:pStyle w:val="Compact"/>
+        <w:numPr>
+          <w:ilvl w:val="0"/>
+          <w:numId w:val="1004"/>
+        </w:numPr>
+      </w:pPr>
+      <w:r>
+        <w:rPr>
+          <w:b/>
+          <w:bCs/>
+        </w:rPr>
+        <w:t xml:space="preserve">Monday:</w:t>
+      </w:r>
+      <w:r>
+        <w:t xml:space="preserve"> </w:t>
+      </w:r>
+      <w:r>
+        <w:t xml:space="preserve">insurance findings presented · onboarding walkthrough with Jordan · incorporation</w:t>
+      </w:r>
+      <w:r>
+        <w:t xml:space="preserve"> </w:t>
+      </w:r>
+      <w:r>
+        <w:t xml:space="preserve">details finalized.</w:t>
+      </w:r>
+    </w:p>
+    <w:p>
+      <w:pPr>
+        <w:pStyle w:val="Compact"/>
+        <w:numPr>
+          <w:ilvl w:val="0"/>
+          <w:numId w:val="1004"/>
+        </w:numPr>
+      </w:pPr>
+      <w:r>
+        <w:rPr>
+          <w:b/>
+          <w:bCs/>
+        </w:rPr>
+        <w:t xml:space="preserve">Tuesday:</w:t>
+      </w:r>
+      <w:r>
+        <w:t xml:space="preserve"> </w:t>
+      </w:r>
+      <w:r>
+        <w:t xml:space="preserve">incorporation completion target.</w:t>
+      </w:r>
+    </w:p>
+    <w:bookmarkEnd w:id="13"/>
+    <w:bookmarkEnd w:id="14"/>
+    <w:bookmarkStart w:id="15" w:name="Xcf17b8baba9cc569637a09a0b3643be44f8ff9d"/>
+    <w:p>
+      <w:pPr>
+        <w:pStyle w:val="Heading2"/>
+      </w:pPr>
+      <w:r>
+        <w:t xml:space="preserve">Near-term: test the setup at the next meeting</w:t>
+      </w:r>
+    </w:p>
+    <w:p>
+      <w:pPr>
+        <w:pStyle w:val="Compact"/>
+        <w:numPr>
+          <w:ilvl w:val="0"/>
+          <w:numId w:val="1005"/>
+        </w:numPr>
+      </w:pPr>
+      <w:r>
+        <w:rPr>
+          <w:b/>
+          <w:bCs/>
+        </w:rPr>
         <w:t xml:space="preserve">Dry-run the full onboarding with Jordan playing a customer.</w:t>
       </w:r>
       <w:r>
@@ -470,7 +928,7 @@
         <w:pStyle w:val="Compact"/>
         <w:numPr>
           <w:ilvl w:val="1"/>
-          <w:numId w:val="1002"/>
+          <w:numId w:val="1006"/>
         </w:numPr>
       </w:pPr>
       <w:r>
@@ -514,7 +972,7 @@
         <w:pStyle w:val="Compact"/>
         <w:numPr>
           <w:ilvl w:val="1"/>
-          <w:numId w:val="1002"/>
+          <w:numId w:val="1006"/>
         </w:numPr>
       </w:pPr>
       <w:r>
@@ -556,8 +1014,8 @@
         </w:pict>
       </w:r>
     </w:p>
-    <w:bookmarkEnd w:id="10"/>
-    <w:bookmarkStart w:id="11" w:name="abdul"/>
+    <w:bookmarkEnd w:id="15"/>
+    <w:bookmarkStart w:id="16" w:name="abdul-1"/>
     <w:p>
       <w:pPr>
         <w:pStyle w:val="Heading2"/>
@@ -571,7 +1029,7 @@
         <w:pStyle w:val="Compact"/>
         <w:numPr>
           <w:ilvl w:val="0"/>
-          <w:numId w:val="1003"/>
+          <w:numId w:val="1007"/>
         </w:numPr>
       </w:pPr>
       <w:r>
@@ -587,7 +1045,7 @@
         <w:pStyle w:val="Compact"/>
         <w:numPr>
           <w:ilvl w:val="1"/>
-          <w:numId w:val="1004"/>
+          <w:numId w:val="1008"/>
         </w:numPr>
       </w:pPr>
       <w:r>
@@ -631,7 +1089,7 @@
         <w:pStyle w:val="Compact"/>
         <w:numPr>
           <w:ilvl w:val="1"/>
-          <w:numId w:val="1004"/>
+          <w:numId w:val="1008"/>
         </w:numPr>
       </w:pPr>
       <w:r>
@@ -652,169 +1110,6 @@
       </w:r>
       <w:r>
         <w:t xml:space="preserve">leaves our personal assets exposed if anything goes wrong.</w:t>
-      </w:r>
-    </w:p>
-    <w:p>
-      <w:pPr>
-        <w:pStyle w:val="Compact"/>
-        <w:numPr>
-          <w:ilvl w:val="0"/>
-          <w:numId w:val="1005"/>
-        </w:numPr>
-      </w:pPr>
-      <w:r>
-        <w:rPr>
-          <w:b/>
-          <w:bCs/>
-        </w:rPr>
-        <w:t xml:space="preserve">GST/HST registration + business bank account.</w:t>
-      </w:r>
-    </w:p>
-    <w:p>
-      <w:pPr>
-        <w:pStyle w:val="Compact"/>
-        <w:numPr>
-          <w:ilvl w:val="1"/>
-          <w:numId w:val="1006"/>
-        </w:numPr>
-      </w:pPr>
-      <w:r>
-        <w:rPr>
-          <w:b/>
-          <w:bCs/>
-        </w:rPr>
-        <w:t xml:space="preserve">What we’re doing:</w:t>
-      </w:r>
-      <w:r>
-        <w:t xml:space="preserve"> </w:t>
-      </w:r>
-      <w:r>
-        <w:t xml:space="preserve">registering for HST (required over $30k/yr, fine to do early) and</w:t>
-      </w:r>
-      <w:r>
-        <w:t xml:space="preserve"> </w:t>
-      </w:r>
-      <w:r>
-        <w:t xml:space="preserve">opening a dedicated business bank account.</w:t>
-      </w:r>
-    </w:p>
-    <w:p>
-      <w:pPr>
-        <w:pStyle w:val="Compact"/>
-        <w:numPr>
-          <w:ilvl w:val="1"/>
-          <w:numId w:val="1006"/>
-        </w:numPr>
-      </w:pPr>
-      <w:r>
-        <w:rPr>
-          <w:b/>
-          <w:bCs/>
-        </w:rPr>
-        <w:t xml:space="preserve">Why:</w:t>
-      </w:r>
-      <w:r>
-        <w:t xml:space="preserve"> </w:t>
-      </w:r>
-      <w:r>
-        <w:t xml:space="preserve">needed to invoice correctly and to keep the</w:t>
-      </w:r>
-      <w:r>
-        <w:t xml:space="preserve"> </w:t>
-      </w:r>
-      <w:r>
-        <w:t xml:space="preserve">“company vs personal”</w:t>
-      </w:r>
-      <w:r>
-        <w:t xml:space="preserve"> </w:t>
-      </w:r>
-      <w:r>
-        <w:t xml:space="preserve">wall real.</w:t>
-      </w:r>
-    </w:p>
-    <w:p>
-      <w:pPr>
-        <w:pStyle w:val="Compact"/>
-        <w:numPr>
-          <w:ilvl w:val="0"/>
-          <w:numId w:val="1007"/>
-        </w:numPr>
-      </w:pPr>
-      <w:r>
-        <w:rPr>
-          <w:b/>
-          <w:bCs/>
-        </w:rPr>
-        <w:t xml:space="preserve">Uptime monitoring + alerting (incl. Vapi balance safety).</w:t>
-      </w:r>
-    </w:p>
-    <w:p>
-      <w:pPr>
-        <w:pStyle w:val="Compact"/>
-        <w:numPr>
-          <w:ilvl w:val="1"/>
-          <w:numId w:val="1008"/>
-        </w:numPr>
-      </w:pPr>
-      <w:r>
-        <w:rPr>
-          <w:b/>
-          <w:bCs/>
-        </w:rPr>
-        <w:t xml:space="preserve">What we’re doing:</w:t>
-      </w:r>
-      <w:r>
-        <w:t xml:space="preserve"> </w:t>
-      </w:r>
-      <w:r>
-        <w:t xml:space="preserve">a watcher that pings the live webhook and alerts us fast if it</w:t>
-      </w:r>
-      <w:r>
-        <w:t xml:space="preserve"> </w:t>
-      </w:r>
-      <w:r>
-        <w:t xml:space="preserve">breaks, plus a</w:t>
-      </w:r>
-      <w:r>
-        <w:t xml:space="preserve"> </w:t>
-      </w:r>
-      <w:r>
-        <w:rPr>
-          <w:b/>
-          <w:bCs/>
-        </w:rPr>
-        <w:t xml:space="preserve">Vapi low-balance alert + auto-reload</w:t>
-      </w:r>
-      <w:r>
-        <w:t xml:space="preserve">.</w:t>
-      </w:r>
-    </w:p>
-    <w:p>
-      <w:pPr>
-        <w:pStyle w:val="Compact"/>
-        <w:numPr>
-          <w:ilvl w:val="1"/>
-          <w:numId w:val="1008"/>
-        </w:numPr>
-      </w:pPr>
-      <w:r>
-        <w:rPr>
-          <w:b/>
-          <w:bCs/>
-        </w:rPr>
-        <w:t xml:space="preserve">Why:</w:t>
-      </w:r>
-      <w:r>
-        <w:t xml:space="preserve"> </w:t>
-      </w:r>
-      <w:r>
-        <w:t xml:space="preserve">all customers run off the system; if the webhook dies or the prepaid balance</w:t>
-      </w:r>
-      <w:r>
-        <w:t xml:space="preserve"> </w:t>
-      </w:r>
-      <w:r>
-        <w:t xml:space="preserve">hits $0, lines go silent and we must know before a customer does.</w:t>
       </w:r>
     </w:p>
     <w:p>
@@ -830,7 +1125,7 @@
           <w:b/>
           <w:bCs/>
         </w:rPr>
-        <w:t xml:space="preserve">Cold-call pitch / script.</w:t>
+        <w:t xml:space="preserve">GST/HST registration + business bank account.</w:t>
       </w:r>
     </w:p>
     <w:p>
@@ -852,13 +1147,13 @@
         <w:t xml:space="preserve"> </w:t>
       </w:r>
       <w:r>
-        <w:t xml:space="preserve">write the actual pitch used on calls — opener, the value in one</w:t>
-      </w:r>
-      <w:r>
-        <w:t xml:space="preserve"> </w:t>
-      </w:r>
-      <w:r>
-        <w:t xml:space="preserve">line, answers to the common objections, and the ask (book a demo).</w:t>
+        <w:t xml:space="preserve">registering for HST (required over $30k/yr, fine to do early) and</w:t>
+      </w:r>
+      <w:r>
+        <w:t xml:space="preserve"> </w:t>
+      </w:r>
+      <w:r>
+        <w:t xml:space="preserve">opening a dedicated business bank account.</w:t>
       </w:r>
     </w:p>
     <w:p>
@@ -880,13 +1175,19 @@
         <w:t xml:space="preserve"> </w:t>
       </w:r>
       <w:r>
-        <w:t xml:space="preserve">this is what turns a cold dial into a booked demo; Abdul is doing the calling,</w:t>
-      </w:r>
-      <w:r>
-        <w:t xml:space="preserve"> </w:t>
-      </w:r>
-      <w:r>
-        <w:t xml:space="preserve">so Abdul owns the script. Needed for the Friday gate.</w:t>
+        <w:t xml:space="preserve">needed to invoice correctly and to keep the</w:t>
+      </w:r>
+      <w:r>
+        <w:t xml:space="preserve"> </w:t>
+      </w:r>
+      <w:r>
+        <w:t xml:space="preserve">“company vs personal”</w:t>
+      </w:r>
+      <w:r>
+        <w:t xml:space="preserve"> </w:t>
+      </w:r>
+      <w:r>
+        <w:t xml:space="preserve">wall real.</w:t>
       </w:r>
     </w:p>
     <w:p>
@@ -902,23 +1203,76 @@
           <w:b/>
           <w:bCs/>
         </w:rPr>
-        <w:t xml:space="preserve">Pricing</w:t>
-      </w:r>
-      <w:r>
-        <w:t xml:space="preserve"> </w:t>
-      </w:r>
-      <w:r>
-        <w:t xml:space="preserve">(with Miguel — see Decisions).</w:t>
-      </w:r>
-    </w:p>
-    <w:bookmarkEnd w:id="11"/>
-    <w:bookmarkStart w:id="12" w:name="miguel"/>
-    <w:p>
-      <w:pPr>
-        <w:pStyle w:val="Heading2"/>
-      </w:pPr>
-      <w:r>
-        <w:t xml:space="preserve">Miguel</w:t>
+        <w:t xml:space="preserve">Uptime monitoring + alerting (incl. Vapi balance safety).</w:t>
+      </w:r>
+    </w:p>
+    <w:p>
+      <w:pPr>
+        <w:pStyle w:val="Compact"/>
+        <w:numPr>
+          <w:ilvl w:val="1"/>
+          <w:numId w:val="1012"/>
+        </w:numPr>
+      </w:pPr>
+      <w:r>
+        <w:rPr>
+          <w:b/>
+          <w:bCs/>
+        </w:rPr>
+        <w:t xml:space="preserve">What we’re doing:</w:t>
+      </w:r>
+      <w:r>
+        <w:t xml:space="preserve"> </w:t>
+      </w:r>
+      <w:r>
+        <w:t xml:space="preserve">a watcher that pings the live webhook and alerts us fast if it</w:t>
+      </w:r>
+      <w:r>
+        <w:t xml:space="preserve"> </w:t>
+      </w:r>
+      <w:r>
+        <w:t xml:space="preserve">breaks, plus a</w:t>
+      </w:r>
+      <w:r>
+        <w:t xml:space="preserve"> </w:t>
+      </w:r>
+      <w:r>
+        <w:rPr>
+          <w:b/>
+          <w:bCs/>
+        </w:rPr>
+        <w:t xml:space="preserve">Vapi low-balance alert + auto-reload</w:t>
+      </w:r>
+      <w:r>
+        <w:t xml:space="preserve">.</w:t>
+      </w:r>
+    </w:p>
+    <w:p>
+      <w:pPr>
+        <w:pStyle w:val="Compact"/>
+        <w:numPr>
+          <w:ilvl w:val="1"/>
+          <w:numId w:val="1012"/>
+        </w:numPr>
+      </w:pPr>
+      <w:r>
+        <w:rPr>
+          <w:b/>
+          <w:bCs/>
+        </w:rPr>
+        <w:t xml:space="preserve">Why:</w:t>
+      </w:r>
+      <w:r>
+        <w:t xml:space="preserve"> </w:t>
+      </w:r>
+      <w:r>
+        <w:t xml:space="preserve">all customers run off the system; if the webhook dies or the prepaid balance</w:t>
+      </w:r>
+      <w:r>
+        <w:t xml:space="preserve"> </w:t>
+      </w:r>
+      <w:r>
+        <w:t xml:space="preserve">hits $0, lines go silent and we must know before a customer does.</w:t>
       </w:r>
     </w:p>
     <w:p>
@@ -926,28 +1280,6 @@
         <w:pStyle w:val="Compact"/>
         <w:numPr>
           <w:ilvl w:val="0"/>
-          <w:numId w:val="1012"/>
-        </w:numPr>
-      </w:pPr>
-      <w:r>
-        <w:t xml:space="preserve">◐</w:t>
-      </w:r>
-      <w:r>
-        <w:t xml:space="preserve"> </w:t>
-      </w:r>
-      <w:r>
-        <w:rPr>
-          <w:b/>
-          <w:bCs/>
-        </w:rPr>
-        <w:t xml:space="preserve">Privacy Policy.</w:t>
-      </w:r>
-    </w:p>
-    <w:p>
-      <w:pPr>
-        <w:pStyle w:val="Compact"/>
-        <w:numPr>
-          <w:ilvl w:val="1"/>
           <w:numId w:val="1013"/>
         </w:numPr>
       </w:pPr>
@@ -956,69 +1288,7 @@
           <w:b/>
           <w:bCs/>
         </w:rPr>
-        <w:t xml:space="preserve">What we’re doing:</w:t>
-      </w:r>
-      <w:r>
-        <w:t xml:space="preserve"> </w:t>
-      </w:r>
-      <w:r>
-        <w:t xml:space="preserve">a public document stating how we collect/store/delete caller data</w:t>
-      </w:r>
-      <w:r>
-        <w:t xml:space="preserve"> </w:t>
-      </w:r>
-      <w:r>
-        <w:t xml:space="preserve">(names, numbers, addresses, transcripts).</w:t>
-      </w:r>
-    </w:p>
-    <w:p>
-      <w:pPr>
-        <w:pStyle w:val="Compact"/>
-        <w:numPr>
-          <w:ilvl w:val="1"/>
-          <w:numId w:val="1013"/>
-        </w:numPr>
-      </w:pPr>
-      <w:r>
-        <w:rPr>
-          <w:b/>
-          <w:bCs/>
-        </w:rPr>
-        <w:t xml:space="preserve">Why:</w:t>
-      </w:r>
-      <w:r>
-        <w:t xml:space="preserve"> </w:t>
-      </w:r>
-      <w:r>
-        <w:t xml:space="preserve">legally required under Canadian privacy law (PIPEDA) because we handle real</w:t>
-      </w:r>
-      <w:r>
-        <w:t xml:space="preserve"> </w:t>
-      </w:r>
-      <w:r>
-        <w:t xml:space="preserve">people’s personal information.</w:t>
-      </w:r>
-    </w:p>
-    <w:p>
-      <w:pPr>
-        <w:pStyle w:val="Compact"/>
-        <w:numPr>
-          <w:ilvl w:val="0"/>
-          <w:numId w:val="1012"/>
-        </w:numPr>
-      </w:pPr>
-      <w:r>
-        <w:t xml:space="preserve">◐</w:t>
-      </w:r>
-      <w:r>
-        <w:t xml:space="preserve"> </w:t>
-      </w:r>
-      <w:r>
-        <w:rPr>
-          <w:b/>
-          <w:bCs/>
-        </w:rPr>
-        <w:t xml:space="preserve">Data Processing terms.</w:t>
+        <w:t xml:space="preserve">Cold-call pitch / script.</w:t>
       </w:r>
     </w:p>
     <w:p>
@@ -1040,13 +1310,13 @@
         <w:t xml:space="preserve"> </w:t>
       </w:r>
       <w:r>
-        <w:t xml:space="preserve">the contract clause saying the locksmith owns their callers’ data</w:t>
-      </w:r>
-      <w:r>
-        <w:t xml:space="preserve"> </w:t>
-      </w:r>
-      <w:r>
-        <w:t xml:space="preserve">and we only process it on their behalf.</w:t>
+        <w:t xml:space="preserve">write the actual pitch used on calls — opener, the value in one</w:t>
+      </w:r>
+      <w:r>
+        <w:t xml:space="preserve"> </w:t>
+      </w:r>
+      <w:r>
+        <w:t xml:space="preserve">line, answers to the common objections, and the ask (book a demo).</w:t>
       </w:r>
     </w:p>
     <w:p>
@@ -1068,6 +1338,194 @@
         <w:t xml:space="preserve"> </w:t>
       </w:r>
       <w:r>
+        <w:t xml:space="preserve">this is what turns a cold dial into a booked demo; Abdul is doing the calling,</w:t>
+      </w:r>
+      <w:r>
+        <w:t xml:space="preserve"> </w:t>
+      </w:r>
+      <w:r>
+        <w:t xml:space="preserve">so Abdul owns the script. Needed for the Friday gate.</w:t>
+      </w:r>
+    </w:p>
+    <w:p>
+      <w:pPr>
+        <w:pStyle w:val="Compact"/>
+        <w:numPr>
+          <w:ilvl w:val="0"/>
+          <w:numId w:val="1015"/>
+        </w:numPr>
+      </w:pPr>
+      <w:r>
+        <w:rPr>
+          <w:b/>
+          <w:bCs/>
+        </w:rPr>
+        <w:t xml:space="preserve">Pricing</w:t>
+      </w:r>
+      <w:r>
+        <w:t xml:space="preserve"> </w:t>
+      </w:r>
+      <w:r>
+        <w:t xml:space="preserve">(with Miguel — see Decisions).</w:t>
+      </w:r>
+    </w:p>
+    <w:bookmarkEnd w:id="16"/>
+    <w:bookmarkStart w:id="17" w:name="miguel-1"/>
+    <w:p>
+      <w:pPr>
+        <w:pStyle w:val="Heading2"/>
+      </w:pPr>
+      <w:r>
+        <w:t xml:space="preserve">Miguel</w:t>
+      </w:r>
+    </w:p>
+    <w:p>
+      <w:pPr>
+        <w:pStyle w:val="Compact"/>
+        <w:numPr>
+          <w:ilvl w:val="0"/>
+          <w:numId w:val="1016"/>
+        </w:numPr>
+      </w:pPr>
+      <w:r>
+        <w:t xml:space="preserve">◐</w:t>
+      </w:r>
+      <w:r>
+        <w:t xml:space="preserve"> </w:t>
+      </w:r>
+      <w:r>
+        <w:rPr>
+          <w:b/>
+          <w:bCs/>
+        </w:rPr>
+        <w:t xml:space="preserve">Privacy Policy.</w:t>
+      </w:r>
+    </w:p>
+    <w:p>
+      <w:pPr>
+        <w:pStyle w:val="Compact"/>
+        <w:numPr>
+          <w:ilvl w:val="1"/>
+          <w:numId w:val="1017"/>
+        </w:numPr>
+      </w:pPr>
+      <w:r>
+        <w:rPr>
+          <w:b/>
+          <w:bCs/>
+        </w:rPr>
+        <w:t xml:space="preserve">What we’re doing:</w:t>
+      </w:r>
+      <w:r>
+        <w:t xml:space="preserve"> </w:t>
+      </w:r>
+      <w:r>
+        <w:t xml:space="preserve">a public document stating how we collect/store/delete caller data</w:t>
+      </w:r>
+      <w:r>
+        <w:t xml:space="preserve"> </w:t>
+      </w:r>
+      <w:r>
+        <w:t xml:space="preserve">(names, numbers, addresses, transcripts).</w:t>
+      </w:r>
+    </w:p>
+    <w:p>
+      <w:pPr>
+        <w:pStyle w:val="Compact"/>
+        <w:numPr>
+          <w:ilvl w:val="1"/>
+          <w:numId w:val="1017"/>
+        </w:numPr>
+      </w:pPr>
+      <w:r>
+        <w:rPr>
+          <w:b/>
+          <w:bCs/>
+        </w:rPr>
+        <w:t xml:space="preserve">Why:</w:t>
+      </w:r>
+      <w:r>
+        <w:t xml:space="preserve"> </w:t>
+      </w:r>
+      <w:r>
+        <w:t xml:space="preserve">legally required under Canadian privacy law (PIPEDA) because we handle real</w:t>
+      </w:r>
+      <w:r>
+        <w:t xml:space="preserve"> </w:t>
+      </w:r>
+      <w:r>
+        <w:t xml:space="preserve">people’s personal information.</w:t>
+      </w:r>
+    </w:p>
+    <w:p>
+      <w:pPr>
+        <w:pStyle w:val="Compact"/>
+        <w:numPr>
+          <w:ilvl w:val="0"/>
+          <w:numId w:val="1016"/>
+        </w:numPr>
+      </w:pPr>
+      <w:r>
+        <w:t xml:space="preserve">◐</w:t>
+      </w:r>
+      <w:r>
+        <w:t xml:space="preserve"> </w:t>
+      </w:r>
+      <w:r>
+        <w:rPr>
+          <w:b/>
+          <w:bCs/>
+        </w:rPr>
+        <w:t xml:space="preserve">Data Processing terms.</w:t>
+      </w:r>
+    </w:p>
+    <w:p>
+      <w:pPr>
+        <w:pStyle w:val="Compact"/>
+        <w:numPr>
+          <w:ilvl w:val="1"/>
+          <w:numId w:val="1018"/>
+        </w:numPr>
+      </w:pPr>
+      <w:r>
+        <w:rPr>
+          <w:b/>
+          <w:bCs/>
+        </w:rPr>
+        <w:t xml:space="preserve">What we’re doing:</w:t>
+      </w:r>
+      <w:r>
+        <w:t xml:space="preserve"> </w:t>
+      </w:r>
+      <w:r>
+        <w:t xml:space="preserve">the contract clause saying the locksmith owns their callers’ data</w:t>
+      </w:r>
+      <w:r>
+        <w:t xml:space="preserve"> </w:t>
+      </w:r>
+      <w:r>
+        <w:t xml:space="preserve">and we only process it on their behalf.</w:t>
+      </w:r>
+    </w:p>
+    <w:p>
+      <w:pPr>
+        <w:pStyle w:val="Compact"/>
+        <w:numPr>
+          <w:ilvl w:val="1"/>
+          <w:numId w:val="1018"/>
+        </w:numPr>
+      </w:pPr>
+      <w:r>
+        <w:rPr>
+          <w:b/>
+          <w:bCs/>
+        </w:rPr>
+        <w:t xml:space="preserve">Why:</w:t>
+      </w:r>
+      <w:r>
+        <w:t xml:space="preserve"> </w:t>
+      </w:r>
+      <w:r>
         <w:t xml:space="preserve">clarifies legal responsibility for the data and is expected by privacy law.</w:t>
       </w:r>
     </w:p>
@@ -1076,7 +1534,7 @@
         <w:pStyle w:val="Compact"/>
         <w:numPr>
           <w:ilvl w:val="0"/>
-          <w:numId w:val="1012"/>
+          <w:numId w:val="1016"/>
         </w:numPr>
       </w:pPr>
       <w:r>
@@ -1098,7 +1556,7 @@
         <w:pStyle w:val="Compact"/>
         <w:numPr>
           <w:ilvl w:val="0"/>
-          <w:numId w:val="1012"/>
+          <w:numId w:val="1016"/>
         </w:numPr>
       </w:pPr>
       <w:r>
@@ -1139,7 +1597,7 @@
         <w:pStyle w:val="Compact"/>
         <w:numPr>
           <w:ilvl w:val="1"/>
-          <w:numId w:val="1015"/>
+          <w:numId w:val="1019"/>
         </w:numPr>
       </w:pPr>
       <w:r>
@@ -1167,7 +1625,7 @@
         <w:pStyle w:val="Compact"/>
         <w:numPr>
           <w:ilvl w:val="1"/>
-          <w:numId w:val="1015"/>
+          <w:numId w:val="1019"/>
         </w:numPr>
       </w:pPr>
       <w:r>
@@ -1195,7 +1653,7 @@
         <w:pStyle w:val="Compact"/>
         <w:numPr>
           <w:ilvl w:val="0"/>
-          <w:numId w:val="1012"/>
+          <w:numId w:val="1016"/>
         </w:numPr>
       </w:pPr>
       <w:r>
@@ -1217,69 +1675,69 @@
         <w:pStyle w:val="Compact"/>
         <w:numPr>
           <w:ilvl w:val="1"/>
+          <w:numId w:val="1020"/>
+        </w:numPr>
+      </w:pPr>
+      <w:r>
+        <w:rPr>
+          <w:b/>
+          <w:bCs/>
+        </w:rPr>
+        <w:t xml:space="preserve">What we’re doing:</w:t>
+      </w:r>
+      <w:r>
+        <w:t xml:space="preserve"> </w:t>
+      </w:r>
+      <w:r>
+        <w:t xml:space="preserve">Stripe subscription + the</w:t>
+      </w:r>
+      <w:r>
+        <w:t xml:space="preserve"> </w:t>
+      </w:r>
+      <w:r>
+        <w:t xml:space="preserve">“sign-contract-then-pay”</w:t>
+      </w:r>
+      <w:r>
+        <w:t xml:space="preserve"> </w:t>
+      </w:r>
+      <w:r>
+        <w:t xml:space="preserve">flow, plus the</w:t>
+      </w:r>
+      <w:r>
+        <w:t xml:space="preserve"> </w:t>
+      </w:r>
+      <w:r>
+        <w:t xml:space="preserve">rule for what happens on a failed payment (suspend vs keep serving).</w:t>
+      </w:r>
+    </w:p>
+    <w:p>
+      <w:pPr>
+        <w:pStyle w:val="Compact"/>
+        <w:numPr>
+          <w:ilvl w:val="1"/>
+          <w:numId w:val="1020"/>
+        </w:numPr>
+      </w:pPr>
+      <w:r>
+        <w:rPr>
+          <w:b/>
+          <w:bCs/>
+        </w:rPr>
+        <w:t xml:space="preserve">Why:</w:t>
+      </w:r>
+      <w:r>
+        <w:t xml:space="preserve"> </w:t>
+      </w:r>
+      <w:r>
+        <w:t xml:space="preserve">this is how we actually collect money and stop serving non-payers.</w:t>
+      </w:r>
+    </w:p>
+    <w:p>
+      <w:pPr>
+        <w:pStyle w:val="Compact"/>
+        <w:numPr>
+          <w:ilvl w:val="0"/>
           <w:numId w:val="1016"/>
-        </w:numPr>
-      </w:pPr>
-      <w:r>
-        <w:rPr>
-          <w:b/>
-          <w:bCs/>
-        </w:rPr>
-        <w:t xml:space="preserve">What we’re doing:</w:t>
-      </w:r>
-      <w:r>
-        <w:t xml:space="preserve"> </w:t>
-      </w:r>
-      <w:r>
-        <w:t xml:space="preserve">Stripe subscription + the</w:t>
-      </w:r>
-      <w:r>
-        <w:t xml:space="preserve"> </w:t>
-      </w:r>
-      <w:r>
-        <w:t xml:space="preserve">“sign-contract-then-pay”</w:t>
-      </w:r>
-      <w:r>
-        <w:t xml:space="preserve"> </w:t>
-      </w:r>
-      <w:r>
-        <w:t xml:space="preserve">flow, plus the</w:t>
-      </w:r>
-      <w:r>
-        <w:t xml:space="preserve"> </w:t>
-      </w:r>
-      <w:r>
-        <w:t xml:space="preserve">rule for what happens on a failed payment (suspend vs keep serving).</w:t>
-      </w:r>
-    </w:p>
-    <w:p>
-      <w:pPr>
-        <w:pStyle w:val="Compact"/>
-        <w:numPr>
-          <w:ilvl w:val="1"/>
-          <w:numId w:val="1016"/>
-        </w:numPr>
-      </w:pPr>
-      <w:r>
-        <w:rPr>
-          <w:b/>
-          <w:bCs/>
-        </w:rPr>
-        <w:t xml:space="preserve">Why:</w:t>
-      </w:r>
-      <w:r>
-        <w:t xml:space="preserve"> </w:t>
-      </w:r>
-      <w:r>
-        <w:t xml:space="preserve">this is how we actually collect money and stop serving non-payers.</w:t>
-      </w:r>
-    </w:p>
-    <w:p>
-      <w:pPr>
-        <w:pStyle w:val="Compact"/>
-        <w:numPr>
-          <w:ilvl w:val="0"/>
-          <w:numId w:val="1012"/>
         </w:numPr>
       </w:pPr>
       <w:r>
@@ -1314,7 +1772,7 @@
         <w:pStyle w:val="Compact"/>
         <w:numPr>
           <w:ilvl w:val="1"/>
-          <w:numId w:val="1017"/>
+          <w:numId w:val="1021"/>
         </w:numPr>
       </w:pPr>
       <w:r>
@@ -1342,7 +1800,7 @@
         <w:pStyle w:val="Compact"/>
         <w:numPr>
           <w:ilvl w:val="1"/>
-          <w:numId w:val="1017"/>
+          <w:numId w:val="1021"/>
         </w:numPr>
       </w:pPr>
       <w:r>
@@ -1413,7 +1871,7 @@
         <w:pStyle w:val="Compact"/>
         <w:numPr>
           <w:ilvl w:val="0"/>
-          <w:numId w:val="1012"/>
+          <w:numId w:val="1016"/>
         </w:numPr>
       </w:pPr>
       <w:r>
@@ -1436,176 +1894,14 @@
         <w:t xml:space="preserve">(with Abdul — see Decisions).</w:t>
       </w:r>
     </w:p>
-    <w:bookmarkEnd w:id="12"/>
-    <w:bookmarkStart w:id="13" w:name="jordan"/>
+    <w:bookmarkEnd w:id="17"/>
+    <w:bookmarkStart w:id="18" w:name="jordan-1"/>
     <w:p>
       <w:pPr>
         <w:pStyle w:val="Heading2"/>
       </w:pPr>
       <w:r>
         <w:t xml:space="preserve">Jordan</w:t>
-      </w:r>
-    </w:p>
-    <w:p>
-      <w:pPr>
-        <w:pStyle w:val="Compact"/>
-        <w:numPr>
-          <w:ilvl w:val="0"/>
-          <w:numId w:val="1018"/>
-        </w:numPr>
-      </w:pPr>
-      <w:r>
-        <w:rPr>
-          <w:b/>
-          <w:bCs/>
-        </w:rPr>
-        <w:t xml:space="preserve">One-page website</w:t>
-      </w:r>
-      <w:r>
-        <w:t xml:space="preserve"> </w:t>
-      </w:r>
-      <w:r>
-        <w:t xml:space="preserve">(Bengal/Dispango domain).</w:t>
-      </w:r>
-    </w:p>
-    <w:p>
-      <w:pPr>
-        <w:pStyle w:val="Compact"/>
-        <w:numPr>
-          <w:ilvl w:val="1"/>
-          <w:numId w:val="1019"/>
-        </w:numPr>
-      </w:pPr>
-      <w:r>
-        <w:rPr>
-          <w:b/>
-          <w:bCs/>
-        </w:rPr>
-        <w:t xml:space="preserve">What we’re doing:</w:t>
-      </w:r>
-      <w:r>
-        <w:t xml:space="preserve"> </w:t>
-      </w:r>
-      <w:r>
-        <w:t xml:space="preserve">a single page — what it does, a demo number to call,</w:t>
-      </w:r>
-      <w:r>
-        <w:t xml:space="preserve"> </w:t>
-      </w:r>
-      <w:r>
-        <w:t xml:space="preserve">“book a demo”</w:t>
-      </w:r>
-      <w:r>
-        <w:t xml:space="preserve"> </w:t>
-      </w:r>
-      <w:r>
-        <w:t xml:space="preserve">button.</w:t>
-      </w:r>
-    </w:p>
-    <w:p>
-      <w:pPr>
-        <w:pStyle w:val="Compact"/>
-        <w:numPr>
-          <w:ilvl w:val="1"/>
-          <w:numId w:val="1019"/>
-        </w:numPr>
-      </w:pPr>
-      <w:r>
-        <w:rPr>
-          <w:b/>
-          <w:bCs/>
-        </w:rPr>
-        <w:t xml:space="preserve">Why:</w:t>
-      </w:r>
-      <w:r>
-        <w:t xml:space="preserve"> </w:t>
-      </w:r>
-      <w:r>
-        <w:t xml:space="preserve">a cold-called locksmith Googles us; no site = no trust = no deal.</w:t>
-      </w:r>
-    </w:p>
-    <w:p>
-      <w:pPr>
-        <w:pStyle w:val="Compact"/>
-        <w:numPr>
-          <w:ilvl w:val="0"/>
-          <w:numId w:val="1020"/>
-        </w:numPr>
-      </w:pPr>
-      <w:r>
-        <w:rPr>
-          <w:b/>
-          <w:bCs/>
-        </w:rPr>
-        <w:t xml:space="preserve">Demo asset</w:t>
-      </w:r>
-      <w:r>
-        <w:t xml:space="preserve"> </w:t>
-      </w:r>
-      <w:r>
-        <w:t xml:space="preserve">— a dedicated demo number/persona, separate from M&amp;J’s real line.</w:t>
-      </w:r>
-    </w:p>
-    <w:p>
-      <w:pPr>
-        <w:pStyle w:val="Compact"/>
-        <w:numPr>
-          <w:ilvl w:val="1"/>
-          <w:numId w:val="1021"/>
-        </w:numPr>
-      </w:pPr>
-      <w:r>
-        <w:rPr>
-          <w:b/>
-          <w:bCs/>
-        </w:rPr>
-        <w:t xml:space="preserve">What we’re doing:</w:t>
-      </w:r>
-      <w:r>
-        <w:t xml:space="preserve"> </w:t>
-      </w:r>
-      <w:r>
-        <w:t xml:space="preserve">a</w:t>
-      </w:r>
-      <w:r>
-        <w:t xml:space="preserve"> </w:t>
-      </w:r>
-      <w:r>
-        <w:t xml:space="preserve">“show-off”</w:t>
-      </w:r>
-      <w:r>
-        <w:t xml:space="preserve"> </w:t>
-      </w:r>
-      <w:r>
-        <w:t xml:space="preserve">number a prospect can call to hear the AI, that</w:t>
-      </w:r>
-      <w:r>
-        <w:t xml:space="preserve"> </w:t>
-      </w:r>
-      <w:r>
-        <w:t xml:space="preserve">doesn’t pollute a real customer’s lead data.</w:t>
-      </w:r>
-    </w:p>
-    <w:p>
-      <w:pPr>
-        <w:pStyle w:val="Compact"/>
-        <w:numPr>
-          <w:ilvl w:val="1"/>
-          <w:numId w:val="1021"/>
-        </w:numPr>
-      </w:pPr>
-      <w:r>
-        <w:rPr>
-          <w:b/>
-          <w:bCs/>
-        </w:rPr>
-        <w:t xml:space="preserve">Why:</w:t>
-      </w:r>
-      <w:r>
-        <w:t xml:space="preserve"> </w:t>
-      </w:r>
-      <w:r>
-        <w:t xml:space="preserve">the live demo is the strongest part of the pitch; it needs its own sandbox.</w:t>
       </w:r>
     </w:p>
     <w:p>
@@ -1621,7 +1917,13 @@
           <w:b/>
           <w:bCs/>
         </w:rPr>
-        <w:t xml:space="preserve">Defined sales motion.</w:t>
+        <w:t xml:space="preserve">One-page website</w:t>
+      </w:r>
+      <w:r>
+        <w:t xml:space="preserve"> </w:t>
+      </w:r>
+      <w:r>
+        <w:t xml:space="preserve">(Bengal/Dispango domain).</w:t>
       </w:r>
     </w:p>
     <w:p>
@@ -1643,13 +1945,19 @@
         <w:t xml:space="preserve"> </w:t>
       </w:r>
       <w:r>
-        <w:t xml:space="preserve">writing the exact step-by-step from cold call → demo → pitch +</w:t>
-      </w:r>
-      <w:r>
-        <w:t xml:space="preserve"> </w:t>
-      </w:r>
-      <w:r>
-        <w:t xml:space="preserve">price → contract → payment → onboard.</w:t>
+        <w:t xml:space="preserve">a single page — what it does, a demo number to call,</w:t>
+      </w:r>
+      <w:r>
+        <w:t xml:space="preserve"> </w:t>
+      </w:r>
+      <w:r>
+        <w:t xml:space="preserve">“book a demo”</w:t>
+      </w:r>
+      <w:r>
+        <w:t xml:space="preserve"> </w:t>
+      </w:r>
+      <w:r>
+        <w:t xml:space="preserve">button.</w:t>
       </w:r>
     </w:p>
     <w:p>
@@ -1671,13 +1979,7 @@
         <w:t xml:space="preserve"> </w:t>
       </w:r>
       <w:r>
-        <w:t xml:space="preserve">we have the front (outreach) and back (onboarding); the middle (how a call</w:t>
-      </w:r>
-      <w:r>
-        <w:t xml:space="preserve"> </w:t>
-      </w:r>
-      <w:r>
-        <w:t xml:space="preserve">becomes a paying customer) is undefined.</w:t>
+        <w:t xml:space="preserve">a cold-called locksmith Googles us; no site = no trust = no deal.</w:t>
       </w:r>
     </w:p>
     <w:p>
@@ -1693,7 +1995,13 @@
           <w:b/>
           <w:bCs/>
         </w:rPr>
-        <w:t xml:space="preserve">Calendar integration on the landing page.</w:t>
+        <w:t xml:space="preserve">Demo asset</w:t>
+      </w:r>
+      <w:r>
+        <w:t xml:space="preserve"> </w:t>
+      </w:r>
+      <w:r>
+        <w:t xml:space="preserve">— a dedicated demo number/persona, separate from M&amp;J’s real line.</w:t>
       </w:r>
     </w:p>
     <w:p>
@@ -1715,13 +2023,25 @@
         <w:t xml:space="preserve"> </w:t>
       </w:r>
       <w:r>
-        <w:t xml:space="preserve">embed the Calendly booking widget into the landing page so a</w:t>
-      </w:r>
-      <w:r>
-        <w:t xml:space="preserve"> </w:t>
-      </w:r>
-      <w:r>
-        <w:t xml:space="preserve">potential customer can schedule a meeting in one click.</w:t>
+        <w:t xml:space="preserve">a</w:t>
+      </w:r>
+      <w:r>
+        <w:t xml:space="preserve"> </w:t>
+      </w:r>
+      <w:r>
+        <w:t xml:space="preserve">“show-off”</w:t>
+      </w:r>
+      <w:r>
+        <w:t xml:space="preserve"> </w:t>
+      </w:r>
+      <w:r>
+        <w:t xml:space="preserve">number a prospect can call to hear the AI, that</w:t>
+      </w:r>
+      <w:r>
+        <w:t xml:space="preserve"> </w:t>
+      </w:r>
+      <w:r>
+        <w:t xml:space="preserve">doesn’t pollute a real customer’s lead data.</w:t>
       </w:r>
     </w:p>
     <w:p>
@@ -1743,19 +2063,7 @@
         <w:t xml:space="preserve"> </w:t>
       </w:r>
       <w:r>
-        <w:t xml:space="preserve">turns a website visitor into a booked demo with no back-and-forth.</w:t>
-      </w:r>
-    </w:p>
-    <w:p>
-      <w:pPr>
-        <w:pStyle w:val="Compact"/>
-        <w:numPr>
-          <w:ilvl w:val="1"/>
-          <w:numId w:val="1025"/>
-        </w:numPr>
-      </w:pPr>
-      <w:r>
-        <w:t xml:space="preserve">Booking link to embed: https://calendly.com/miguel-dispango/30min</w:t>
+        <w:t xml:space="preserve">the live demo is the strongest part of the pitch; it needs its own sandbox.</w:t>
       </w:r>
     </w:p>
     <w:p>
@@ -1771,7 +2079,7 @@
           <w:b/>
           <w:bCs/>
         </w:rPr>
-        <w:t xml:space="preserve">Step-by-step setup document + new-customer runbook.</w:t>
+        <w:t xml:space="preserve">Defined sales motion.</w:t>
       </w:r>
     </w:p>
     <w:p>
@@ -1793,13 +2101,13 @@
         <w:t xml:space="preserve"> </w:t>
       </w:r>
       <w:r>
-        <w:t xml:space="preserve">one clear document with the EXACT setup steps (below), used both</w:t>
-      </w:r>
-      <w:r>
-        <w:t xml:space="preserve"> </w:t>
-      </w:r>
-      <w:r>
-        <w:t xml:space="preserve">as our internal checklist and as the customer’s guide.</w:t>
+        <w:t xml:space="preserve">writing the exact step-by-step from cold call → demo → pitch +</w:t>
+      </w:r>
+      <w:r>
+        <w:t xml:space="preserve"> </w:t>
+      </w:r>
+      <w:r>
+        <w:t xml:space="preserve">price → contract → payment → onboard.</w:t>
       </w:r>
     </w:p>
     <w:p>
@@ -1821,6 +2129,156 @@
         <w:t xml:space="preserve"> </w:t>
       </w:r>
       <w:r>
+        <w:t xml:space="preserve">we have the front (outreach) and back (onboarding); the middle (how a call</w:t>
+      </w:r>
+      <w:r>
+        <w:t xml:space="preserve"> </w:t>
+      </w:r>
+      <w:r>
+        <w:t xml:space="preserve">becomes a paying customer) is undefined.</w:t>
+      </w:r>
+    </w:p>
+    <w:p>
+      <w:pPr>
+        <w:pStyle w:val="Compact"/>
+        <w:numPr>
+          <w:ilvl w:val="0"/>
+          <w:numId w:val="1028"/>
+        </w:numPr>
+      </w:pPr>
+      <w:r>
+        <w:rPr>
+          <w:b/>
+          <w:bCs/>
+        </w:rPr>
+        <w:t xml:space="preserve">Calendar integration on the landing page.</w:t>
+      </w:r>
+    </w:p>
+    <w:p>
+      <w:pPr>
+        <w:pStyle w:val="Compact"/>
+        <w:numPr>
+          <w:ilvl w:val="1"/>
+          <w:numId w:val="1029"/>
+        </w:numPr>
+      </w:pPr>
+      <w:r>
+        <w:rPr>
+          <w:b/>
+          <w:bCs/>
+        </w:rPr>
+        <w:t xml:space="preserve">What we’re doing:</w:t>
+      </w:r>
+      <w:r>
+        <w:t xml:space="preserve"> </w:t>
+      </w:r>
+      <w:r>
+        <w:t xml:space="preserve">embed the Calendly booking widget into the landing page so a</w:t>
+      </w:r>
+      <w:r>
+        <w:t xml:space="preserve"> </w:t>
+      </w:r>
+      <w:r>
+        <w:t xml:space="preserve">potential customer can schedule a meeting in one click.</w:t>
+      </w:r>
+    </w:p>
+    <w:p>
+      <w:pPr>
+        <w:pStyle w:val="Compact"/>
+        <w:numPr>
+          <w:ilvl w:val="1"/>
+          <w:numId w:val="1029"/>
+        </w:numPr>
+      </w:pPr>
+      <w:r>
+        <w:rPr>
+          <w:b/>
+          <w:bCs/>
+        </w:rPr>
+        <w:t xml:space="preserve">Why:</w:t>
+      </w:r>
+      <w:r>
+        <w:t xml:space="preserve"> </w:t>
+      </w:r>
+      <w:r>
+        <w:t xml:space="preserve">turns a website visitor into a booked demo with no back-and-forth.</w:t>
+      </w:r>
+    </w:p>
+    <w:p>
+      <w:pPr>
+        <w:pStyle w:val="Compact"/>
+        <w:numPr>
+          <w:ilvl w:val="1"/>
+          <w:numId w:val="1029"/>
+        </w:numPr>
+      </w:pPr>
+      <w:r>
+        <w:t xml:space="preserve">Booking link to embed: https://calendly.com/miguel-dispango/30min</w:t>
+      </w:r>
+    </w:p>
+    <w:p>
+      <w:pPr>
+        <w:pStyle w:val="Compact"/>
+        <w:numPr>
+          <w:ilvl w:val="0"/>
+          <w:numId w:val="1030"/>
+        </w:numPr>
+      </w:pPr>
+      <w:r>
+        <w:rPr>
+          <w:b/>
+          <w:bCs/>
+        </w:rPr>
+        <w:t xml:space="preserve">Step-by-step setup document + new-customer runbook.</w:t>
+      </w:r>
+    </w:p>
+    <w:p>
+      <w:pPr>
+        <w:pStyle w:val="Compact"/>
+        <w:numPr>
+          <w:ilvl w:val="1"/>
+          <w:numId w:val="1031"/>
+        </w:numPr>
+      </w:pPr>
+      <w:r>
+        <w:rPr>
+          <w:b/>
+          <w:bCs/>
+        </w:rPr>
+        <w:t xml:space="preserve">What we’re doing:</w:t>
+      </w:r>
+      <w:r>
+        <w:t xml:space="preserve"> </w:t>
+      </w:r>
+      <w:r>
+        <w:t xml:space="preserve">one clear document with the EXACT setup steps (below), used both</w:t>
+      </w:r>
+      <w:r>
+        <w:t xml:space="preserve"> </w:t>
+      </w:r>
+      <w:r>
+        <w:t xml:space="preserve">as our internal checklist and as the customer’s guide.</w:t>
+      </w:r>
+    </w:p>
+    <w:p>
+      <w:pPr>
+        <w:pStyle w:val="Compact"/>
+        <w:numPr>
+          <w:ilvl w:val="1"/>
+          <w:numId w:val="1031"/>
+        </w:numPr>
+      </w:pPr>
+      <w:r>
+        <w:rPr>
+          <w:b/>
+          <w:bCs/>
+        </w:rPr>
+        <w:t xml:space="preserve">Why:</w:t>
+      </w:r>
+      <w:r>
+        <w:t xml:space="preserve"> </w:t>
+      </w:r>
+      <w:r>
         <w:t xml:space="preserve">setup must be repeatable by anyone, not just whoever built it. This is what we</w:t>
       </w:r>
       <w:r>
@@ -1835,7 +2293,7 @@
         <w:pStyle w:val="Compact"/>
         <w:numPr>
           <w:ilvl w:val="1"/>
-          <w:numId w:val="1027"/>
+          <w:numId w:val="1031"/>
         </w:numPr>
       </w:pPr>
       <w:r>
@@ -1925,7 +2383,7 @@
         <w:pStyle w:val="Compact"/>
         <w:numPr>
           <w:ilvl w:val="2"/>
-          <w:numId w:val="1028"/>
+          <w:numId w:val="1032"/>
         </w:numPr>
       </w:pPr>
       <w:r>
@@ -1975,7 +2433,7 @@
         <w:pStyle w:val="Compact"/>
         <w:numPr>
           <w:ilvl w:val="0"/>
-          <w:numId w:val="1029"/>
+          <w:numId w:val="1033"/>
         </w:numPr>
       </w:pPr>
       <w:r>
@@ -1991,7 +2449,7 @@
         <w:pStyle w:val="Compact"/>
         <w:numPr>
           <w:ilvl w:val="1"/>
-          <w:numId w:val="1030"/>
+          <w:numId w:val="1034"/>
         </w:numPr>
       </w:pPr>
       <w:r>
@@ -2019,7 +2477,7 @@
         <w:pStyle w:val="Compact"/>
         <w:numPr>
           <w:ilvl w:val="1"/>
-          <w:numId w:val="1030"/>
+          <w:numId w:val="1034"/>
         </w:numPr>
       </w:pPr>
       <w:r>
@@ -2041,7 +2499,7 @@
         <w:pStyle w:val="Compact"/>
         <w:numPr>
           <w:ilvl w:val="0"/>
-          <w:numId w:val="1031"/>
+          <w:numId w:val="1035"/>
         </w:numPr>
       </w:pPr>
       <w:r>
@@ -2063,7 +2521,7 @@
         <w:pStyle w:val="Compact"/>
         <w:numPr>
           <w:ilvl w:val="1"/>
-          <w:numId w:val="1032"/>
+          <w:numId w:val="1036"/>
         </w:numPr>
       </w:pPr>
       <w:r>
@@ -2133,7 +2591,7 @@
         <w:pStyle w:val="Compact"/>
         <w:numPr>
           <w:ilvl w:val="1"/>
-          <w:numId w:val="1032"/>
+          <w:numId w:val="1036"/>
         </w:numPr>
       </w:pPr>
       <w:r>
@@ -2163,8 +2621,8 @@
         </w:pict>
       </w:r>
     </w:p>
-    <w:bookmarkEnd w:id="13"/>
-    <w:bookmarkStart w:id="14" w:name="X5c2b4200e1ef5a437a5b15dff4aab2bb5179f37"/>
+    <w:bookmarkEnd w:id="18"/>
+    <w:bookmarkStart w:id="19" w:name="X5c2b4200e1ef5a437a5b15dff4aab2bb5179f37"/>
     <w:p>
       <w:pPr>
         <w:pStyle w:val="Heading2"/>
@@ -2213,7 +2671,7 @@
         <w:pStyle w:val="Compact"/>
         <w:numPr>
           <w:ilvl w:val="0"/>
-          <w:numId w:val="1033"/>
+          <w:numId w:val="1037"/>
         </w:numPr>
       </w:pPr>
       <w:r>
@@ -2241,7 +2699,7 @@
         <w:pStyle w:val="Compact"/>
         <w:numPr>
           <w:ilvl w:val="0"/>
-          <w:numId w:val="1033"/>
+          <w:numId w:val="1037"/>
         </w:numPr>
       </w:pPr>
       <w:r>
@@ -2269,7 +2727,7 @@
         <w:pStyle w:val="Compact"/>
         <w:numPr>
           <w:ilvl w:val="0"/>
-          <w:numId w:val="1033"/>
+          <w:numId w:val="1037"/>
         </w:numPr>
       </w:pPr>
       <w:r>
@@ -2297,7 +2755,7 @@
         <w:pStyle w:val="Compact"/>
         <w:numPr>
           <w:ilvl w:val="0"/>
-          <w:numId w:val="1033"/>
+          <w:numId w:val="1037"/>
         </w:numPr>
       </w:pPr>
       <w:r>
@@ -2331,7 +2789,7 @@
         <w:pStyle w:val="Compact"/>
         <w:numPr>
           <w:ilvl w:val="0"/>
-          <w:numId w:val="1033"/>
+          <w:numId w:val="1037"/>
         </w:numPr>
       </w:pPr>
       <w:r>
@@ -2369,8 +2827,8 @@
         </w:pict>
       </w:r>
     </w:p>
-    <w:bookmarkEnd w:id="14"/>
-    <w:bookmarkStart w:id="15" w:name="Xc647223b06f41716fb34d1332642ae732271518"/>
+    <w:bookmarkEnd w:id="19"/>
+    <w:bookmarkStart w:id="20" w:name="Xc647223b06f41716fb34d1332642ae732271518"/>
     <w:p>
       <w:pPr>
         <w:pStyle w:val="Heading2"/>
@@ -2443,7 +2901,7 @@
         <w:pStyle w:val="Compact"/>
         <w:numPr>
           <w:ilvl w:val="0"/>
-          <w:numId w:val="1034"/>
+          <w:numId w:val="1038"/>
         </w:numPr>
       </w:pPr>
       <w:r>
@@ -2455,7 +2913,7 @@
         <w:pStyle w:val="Compact"/>
         <w:numPr>
           <w:ilvl w:val="0"/>
-          <w:numId w:val="1034"/>
+          <w:numId w:val="1038"/>
         </w:numPr>
       </w:pPr>
       <w:r>
@@ -2510,7 +2968,7 @@
         <w:pStyle w:val="Compact"/>
         <w:numPr>
           <w:ilvl w:val="0"/>
-          <w:numId w:val="1034"/>
+          <w:numId w:val="1038"/>
         </w:numPr>
       </w:pPr>
       <w:r>
@@ -2538,7 +2996,7 @@
         <w:pStyle w:val="Compact"/>
         <w:numPr>
           <w:ilvl w:val="0"/>
-          <w:numId w:val="1034"/>
+          <w:numId w:val="1038"/>
         </w:numPr>
       </w:pPr>
       <w:r>
@@ -2656,8 +3114,8 @@
         </w:pict>
       </w:r>
     </w:p>
-    <w:bookmarkEnd w:id="15"/>
-    <w:bookmarkStart w:id="16" w:name="decisions-needed-founders"/>
+    <w:bookmarkEnd w:id="20"/>
+    <w:bookmarkStart w:id="21" w:name="decisions-needed-founders"/>
     <w:p>
       <w:pPr>
         <w:pStyle w:val="Heading2"/>
@@ -2671,7 +3129,7 @@
         <w:pStyle w:val="Compact"/>
         <w:numPr>
           <w:ilvl w:val="0"/>
-          <w:numId w:val="1035"/>
+          <w:numId w:val="1039"/>
         </w:numPr>
       </w:pPr>
       <w:r>
@@ -2705,7 +3163,7 @@
         <w:pStyle w:val="Compact"/>
         <w:numPr>
           <w:ilvl w:val="0"/>
-          <w:numId w:val="1035"/>
+          <w:numId w:val="1039"/>
         </w:numPr>
       </w:pPr>
       <w:r>
@@ -2733,7 +3191,7 @@
         <w:pStyle w:val="Compact"/>
         <w:numPr>
           <w:ilvl w:val="1"/>
-          <w:numId w:val="1036"/>
+          <w:numId w:val="1040"/>
         </w:numPr>
       </w:pPr>
       <w:r>
@@ -2773,7 +3231,7 @@
         <w:pStyle w:val="Compact"/>
         <w:numPr>
           <w:ilvl w:val="1"/>
-          <w:numId w:val="1036"/>
+          <w:numId w:val="1040"/>
         </w:numPr>
       </w:pPr>
       <w:r>
@@ -2826,8 +3284,8 @@
         <w:t xml:space="preserve">without the overhead.</w:t>
       </w:r>
     </w:p>
-    <w:bookmarkEnd w:id="16"/>
-    <w:bookmarkStart w:id="17" w:name="X1cde240ba5bed758d890604284136458a5fb0a3"/>
+    <w:bookmarkEnd w:id="21"/>
+    <w:bookmarkStart w:id="22" w:name="X1cde240ba5bed758d890604284136458a5fb0a3"/>
     <w:p>
       <w:pPr>
         <w:pStyle w:val="Heading2"/>
@@ -2855,7 +3313,7 @@
         <w:pStyle w:val="Compact"/>
         <w:numPr>
           <w:ilvl w:val="0"/>
-          <w:numId w:val="1037"/>
+          <w:numId w:val="1041"/>
         </w:numPr>
       </w:pPr>
       <w:r>
@@ -2877,7 +3335,7 @@
         <w:pStyle w:val="Compact"/>
         <w:numPr>
           <w:ilvl w:val="1"/>
-          <w:numId w:val="1038"/>
+          <w:numId w:val="1042"/>
         </w:numPr>
       </w:pPr>
       <w:r>
@@ -2919,7 +3377,7 @@
         <w:pStyle w:val="Compact"/>
         <w:numPr>
           <w:ilvl w:val="0"/>
-          <w:numId w:val="1037"/>
+          <w:numId w:val="1041"/>
         </w:numPr>
       </w:pPr>
       <w:r>
@@ -2959,7 +3417,7 @@
         <w:pStyle w:val="Compact"/>
         <w:numPr>
           <w:ilvl w:val="0"/>
-          <w:numId w:val="1037"/>
+          <w:numId w:val="1041"/>
         </w:numPr>
       </w:pPr>
       <w:r>
@@ -3002,7 +3460,7 @@
         <w:pStyle w:val="Compact"/>
         <w:numPr>
           <w:ilvl w:val="0"/>
-          <w:numId w:val="1037"/>
+          <w:numId w:val="1041"/>
         </w:numPr>
       </w:pPr>
       <w:r>
@@ -3030,7 +3488,7 @@
         <w:pStyle w:val="Compact"/>
         <w:numPr>
           <w:ilvl w:val="0"/>
-          <w:numId w:val="1037"/>
+          <w:numId w:val="1041"/>
         </w:numPr>
       </w:pPr>
       <w:r>
@@ -3052,7 +3510,7 @@
         <w:pStyle w:val="Compact"/>
         <w:numPr>
           <w:ilvl w:val="0"/>
-          <w:numId w:val="1037"/>
+          <w:numId w:val="1041"/>
         </w:numPr>
       </w:pPr>
       <w:r>
@@ -3105,8 +3563,8 @@
         <w:t xml:space="preserve">Canadian/CASL-native, local owner-run service, and price.</w:t>
       </w:r>
     </w:p>
-    <w:bookmarkEnd w:id="17"/>
-    <w:bookmarkStart w:id="18" w:name="deferred-nothing-right-now"/>
+    <w:bookmarkEnd w:id="22"/>
+    <w:bookmarkStart w:id="23" w:name="deferred-nothing-right-now"/>
     <w:p>
       <w:pPr>
         <w:pStyle w:val="Heading2"/>
@@ -3120,7 +3578,7 @@
         <w:pStyle w:val="Compact"/>
         <w:numPr>
           <w:ilvl w:val="0"/>
-          <w:numId w:val="1039"/>
+          <w:numId w:val="1043"/>
         </w:numPr>
       </w:pPr>
       <w:r>
@@ -3134,8 +3592,8 @@
         </w:pict>
       </w:r>
     </w:p>
-    <w:bookmarkEnd w:id="18"/>
-    <w:bookmarkStart w:id="20" w:name="X0c458fc708dedcc70c988e214b4ecbe73cf38f1"/>
+    <w:bookmarkEnd w:id="23"/>
+    <w:bookmarkStart w:id="25" w:name="X0c458fc708dedcc70c988e214b4ecbe73cf38f1"/>
     <w:p>
       <w:pPr>
         <w:pStyle w:val="Heading2"/>
@@ -3316,7 +3774,7 @@
         <w:t xml:space="preserve">“everything finished.”</w:t>
       </w:r>
     </w:p>
-    <w:bookmarkStart w:id="19" w:name="still-worth-a-thought-not-blockers"/>
+    <w:bookmarkStart w:id="24" w:name="still-worth-a-thought-not-blockers"/>
     <w:p>
       <w:pPr>
         <w:pStyle w:val="Heading3"/>
@@ -3330,7 +3788,7 @@
         <w:pStyle w:val="Compact"/>
         <w:numPr>
           <w:ilvl w:val="0"/>
-          <w:numId w:val="1040"/>
+          <w:numId w:val="1044"/>
         </w:numPr>
       </w:pPr>
       <w:r>
@@ -3370,7 +3828,7 @@
         <w:pStyle w:val="Compact"/>
         <w:numPr>
           <w:ilvl w:val="0"/>
-          <w:numId w:val="1040"/>
+          <w:numId w:val="1044"/>
         </w:numPr>
       </w:pPr>
       <w:r>
@@ -3398,7 +3856,7 @@
         <w:pStyle w:val="Compact"/>
         <w:numPr>
           <w:ilvl w:val="0"/>
-          <w:numId w:val="1040"/>
+          <w:numId w:val="1044"/>
         </w:numPr>
       </w:pPr>
       <w:r>
@@ -3415,9 +3873,9 @@
         <w:t xml:space="preserve">(part of billing).</w:t>
       </w:r>
     </w:p>
-    <w:bookmarkEnd w:id="19"/>
-    <w:bookmarkEnd w:id="20"/>
-    <w:bookmarkEnd w:id="21"/>
+    <w:bookmarkEnd w:id="24"/>
+    <w:bookmarkEnd w:id="25"/>
+    <w:bookmarkEnd w:id="26"/>
     <w:sectPr>
       <w:footnotePr>
         <w:numRestart w:val="eachSect"/>
@@ -3528,82 +3986,6 @@
       </w:pPr>
     </w:lvl>
   </w:abstractNum>
-  <w:abstractNum w:abstractNumId="992">
-    <w:nsid w:val="0000A992"/>
-    <w:multiLevelType w:val="multilevel"/>
-    <w:lvl w:ilvl="0">
-      <w:numFmt w:val="bullet"/>
-      <w:lvlText w:val="☐"/>
-      <w:lvlJc w:val="left"/>
-      <w:pPr>
-        <w:ind w:left="720" w:hanging="360"/>
-      </w:pPr>
-    </w:lvl>
-    <w:lvl w:ilvl="1">
-      <w:numFmt w:val="bullet"/>
-      <w:lvlText w:val="☐"/>
-      <w:lvlJc w:val="left"/>
-      <w:pPr>
-        <w:ind w:left="1440" w:hanging="360"/>
-      </w:pPr>
-    </w:lvl>
-    <w:lvl w:ilvl="2">
-      <w:numFmt w:val="bullet"/>
-      <w:lvlText w:val="☐"/>
-      <w:lvlJc w:val="left"/>
-      <w:pPr>
-        <w:ind w:left="2160" w:hanging="360"/>
-      </w:pPr>
-    </w:lvl>
-    <w:lvl w:ilvl="3">
-      <w:numFmt w:val="bullet"/>
-      <w:lvlText w:val="☐"/>
-      <w:lvlJc w:val="left"/>
-      <w:pPr>
-        <w:ind w:left="2880" w:hanging="360"/>
-      </w:pPr>
-    </w:lvl>
-    <w:lvl w:ilvl="4">
-      <w:numFmt w:val="bullet"/>
-      <w:lvlText w:val="☐"/>
-      <w:lvlJc w:val="left"/>
-      <w:pPr>
-        <w:ind w:left="3600" w:hanging="360"/>
-      </w:pPr>
-    </w:lvl>
-    <w:lvl w:ilvl="5">
-      <w:numFmt w:val="bullet"/>
-      <w:lvlText w:val="☐"/>
-      <w:lvlJc w:val="left"/>
-      <w:pPr>
-        <w:ind w:left="4320" w:hanging="360"/>
-      </w:pPr>
-    </w:lvl>
-    <w:lvl w:ilvl="6">
-      <w:numFmt w:val="bullet"/>
-      <w:lvlText w:val="☐"/>
-      <w:lvlJc w:val="left"/>
-      <w:pPr>
-        <w:ind w:left="5040" w:hanging="360"/>
-      </w:pPr>
-    </w:lvl>
-    <w:lvl w:ilvl="7">
-      <w:numFmt w:val="bullet"/>
-      <w:lvlText w:val="☐"/>
-      <w:lvlJc w:val="left"/>
-      <w:pPr>
-        <w:ind w:left="5760" w:hanging="360"/>
-      </w:pPr>
-    </w:lvl>
-    <w:lvl w:ilvl="8">
-      <w:numFmt w:val="bullet"/>
-      <w:lvlText w:val="☐"/>
-      <w:lvlJc w:val="left"/>
-      <w:pPr>
-        <w:ind w:left="6480" w:hanging="360"/>
-      </w:pPr>
-    </w:lvl>
-  </w:abstractNum>
   <w:abstractNum w:abstractNumId="991">
     <w:nsid w:val="0000A991"/>
     <w:multiLevelType w:val="multilevel"/>
@@ -3705,6 +4087,82 @@
       <w:rPr>
         <w:rFonts w:ascii="Wingdings" w:hAnsi="Wingdings" w:cs="Wingdings" w:hint="default"/>
       </w:rPr>
+    </w:lvl>
+  </w:abstractNum>
+  <w:abstractNum w:abstractNumId="992">
+    <w:nsid w:val="0000A992"/>
+    <w:multiLevelType w:val="multilevel"/>
+    <w:lvl w:ilvl="0">
+      <w:numFmt w:val="bullet"/>
+      <w:lvlText w:val="☐"/>
+      <w:lvlJc w:val="left"/>
+      <w:pPr>
+        <w:ind w:left="720" w:hanging="360"/>
+      </w:pPr>
+    </w:lvl>
+    <w:lvl w:ilvl="1">
+      <w:numFmt w:val="bullet"/>
+      <w:lvlText w:val="☐"/>
+      <w:lvlJc w:val="left"/>
+      <w:pPr>
+        <w:ind w:left="1440" w:hanging="360"/>
+      </w:pPr>
+    </w:lvl>
+    <w:lvl w:ilvl="2">
+      <w:numFmt w:val="bullet"/>
+      <w:lvlText w:val="☐"/>
+      <w:lvlJc w:val="left"/>
+      <w:pPr>
+        <w:ind w:left="2160" w:hanging="360"/>
+      </w:pPr>
+    </w:lvl>
+    <w:lvl w:ilvl="3">
+      <w:numFmt w:val="bullet"/>
+      <w:lvlText w:val="☐"/>
+      <w:lvlJc w:val="left"/>
+      <w:pPr>
+        <w:ind w:left="2880" w:hanging="360"/>
+      </w:pPr>
+    </w:lvl>
+    <w:lvl w:ilvl="4">
+      <w:numFmt w:val="bullet"/>
+      <w:lvlText w:val="☐"/>
+      <w:lvlJc w:val="left"/>
+      <w:pPr>
+        <w:ind w:left="3600" w:hanging="360"/>
+      </w:pPr>
+    </w:lvl>
+    <w:lvl w:ilvl="5">
+      <w:numFmt w:val="bullet"/>
+      <w:lvlText w:val="☐"/>
+      <w:lvlJc w:val="left"/>
+      <w:pPr>
+        <w:ind w:left="4320" w:hanging="360"/>
+      </w:pPr>
+    </w:lvl>
+    <w:lvl w:ilvl="6">
+      <w:numFmt w:val="bullet"/>
+      <w:lvlText w:val="☐"/>
+      <w:lvlJc w:val="left"/>
+      <w:pPr>
+        <w:ind w:left="5040" w:hanging="360"/>
+      </w:pPr>
+    </w:lvl>
+    <w:lvl w:ilvl="7">
+      <w:numFmt w:val="bullet"/>
+      <w:lvlText w:val="☐"/>
+      <w:lvlJc w:val="left"/>
+      <w:pPr>
+        <w:ind w:left="5760" w:hanging="360"/>
+      </w:pPr>
+    </w:lvl>
+    <w:lvl w:ilvl="8">
+      <w:numFmt w:val="bullet"/>
+      <w:lvlText w:val="☐"/>
+      <w:lvlJc w:val="left"/>
+      <w:pPr>
+        <w:ind w:left="6480" w:hanging="360"/>
+      </w:pPr>
     </w:lvl>
   </w:abstractNum>
   <w:abstractNum w:abstractNumId="99433">
@@ -3881,13 +4339,13 @@
     <w:abstractNumId w:val="990"/>
   </w:num>
   <w:num w:numId="1001">
-    <w:abstractNumId w:val="992"/>
+    <w:abstractNumId w:val="991"/>
   </w:num>
   <w:num w:numId="1002">
     <w:abstractNumId w:val="991"/>
   </w:num>
   <w:num w:numId="1003">
-    <w:abstractNumId w:val="992"/>
+    <w:abstractNumId w:val="991"/>
   </w:num>
   <w:num w:numId="1004">
     <w:abstractNumId w:val="991"/>
@@ -3917,13 +4375,13 @@
     <w:abstractNumId w:val="991"/>
   </w:num>
   <w:num w:numId="1013">
-    <w:abstractNumId w:val="991"/>
+    <w:abstractNumId w:val="992"/>
   </w:num>
   <w:num w:numId="1014">
     <w:abstractNumId w:val="991"/>
   </w:num>
   <w:num w:numId="1015">
-    <w:abstractNumId w:val="991"/>
+    <w:abstractNumId w:val="992"/>
   </w:num>
   <w:num w:numId="1016">
     <w:abstractNumId w:val="991"/>
@@ -3932,13 +4390,13 @@
     <w:abstractNumId w:val="991"/>
   </w:num>
   <w:num w:numId="1018">
-    <w:abstractNumId w:val="992"/>
+    <w:abstractNumId w:val="991"/>
   </w:num>
   <w:num w:numId="1019">
     <w:abstractNumId w:val="991"/>
   </w:num>
   <w:num w:numId="1020">
-    <w:abstractNumId w:val="992"/>
+    <w:abstractNumId w:val="991"/>
   </w:num>
   <w:num w:numId="1021">
     <w:abstractNumId w:val="991"/>
@@ -3962,6 +4420,18 @@
     <w:abstractNumId w:val="991"/>
   </w:num>
   <w:num w:numId="1028">
+    <w:abstractNumId w:val="992"/>
+  </w:num>
+  <w:num w:numId="1029">
+    <w:abstractNumId w:val="991"/>
+  </w:num>
+  <w:num w:numId="1030">
+    <w:abstractNumId w:val="992"/>
+  </w:num>
+  <w:num w:numId="1031">
+    <w:abstractNumId w:val="991"/>
+  </w:num>
+  <w:num w:numId="1032">
     <w:abstractNumId w:val="99433"/>
     <w:lvlOverride w:ilvl="0">
       <w:startOverride w:val="3"/>
@@ -3991,80 +4461,14 @@
       <w:startOverride w:val="3"/>
     </w:lvlOverride>
   </w:num>
-  <w:num w:numId="1029">
+  <w:num w:numId="1033">
     <w:abstractNumId w:val="992"/>
   </w:num>
-  <w:num w:numId="1030">
+  <w:num w:numId="1034">
     <w:abstractNumId w:val="991"/>
   </w:num>
-  <w:num w:numId="1031">
+  <w:num w:numId="1035">
     <w:abstractNumId w:val="992"/>
-  </w:num>
-  <w:num w:numId="1032">
-    <w:abstractNumId w:val="991"/>
-  </w:num>
-  <w:num w:numId="1033">
-    <w:abstractNumId w:val="99411"/>
-    <w:lvlOverride w:ilvl="0">
-      <w:startOverride w:val="1"/>
-    </w:lvlOverride>
-    <w:lvlOverride w:ilvl="1">
-      <w:startOverride w:val="1"/>
-    </w:lvlOverride>
-    <w:lvlOverride w:ilvl="2">
-      <w:startOverride w:val="1"/>
-    </w:lvlOverride>
-    <w:lvlOverride w:ilvl="3">
-      <w:startOverride w:val="1"/>
-    </w:lvlOverride>
-    <w:lvlOverride w:ilvl="4">
-      <w:startOverride w:val="1"/>
-    </w:lvlOverride>
-    <w:lvlOverride w:ilvl="5">
-      <w:startOverride w:val="1"/>
-    </w:lvlOverride>
-    <w:lvlOverride w:ilvl="6">
-      <w:startOverride w:val="1"/>
-    </w:lvlOverride>
-    <w:lvlOverride w:ilvl="7">
-      <w:startOverride w:val="1"/>
-    </w:lvlOverride>
-    <w:lvlOverride w:ilvl="8">
-      <w:startOverride w:val="1"/>
-    </w:lvlOverride>
-  </w:num>
-  <w:num w:numId="1034">
-    <w:abstractNumId w:val="99411"/>
-    <w:lvlOverride w:ilvl="0">
-      <w:startOverride w:val="1"/>
-    </w:lvlOverride>
-    <w:lvlOverride w:ilvl="1">
-      <w:startOverride w:val="1"/>
-    </w:lvlOverride>
-    <w:lvlOverride w:ilvl="2">
-      <w:startOverride w:val="1"/>
-    </w:lvlOverride>
-    <w:lvlOverride w:ilvl="3">
-      <w:startOverride w:val="1"/>
-    </w:lvlOverride>
-    <w:lvlOverride w:ilvl="4">
-      <w:startOverride w:val="1"/>
-    </w:lvlOverride>
-    <w:lvlOverride w:ilvl="5">
-      <w:startOverride w:val="1"/>
-    </w:lvlOverride>
-    <w:lvlOverride w:ilvl="6">
-      <w:startOverride w:val="1"/>
-    </w:lvlOverride>
-    <w:lvlOverride w:ilvl="7">
-      <w:startOverride w:val="1"/>
-    </w:lvlOverride>
-    <w:lvlOverride w:ilvl="8">
-      <w:startOverride w:val="1"/>
-    </w:lvlOverride>
-  </w:num>
-  <w:num w:numId="1035">
-    <w:abstractNumId w:val="991"/>
   </w:num>
   <w:num w:numId="1036">
     <w:abstractNumId w:val="991"/>
@@ -4100,12 +4504,78 @@
     </w:lvlOverride>
   </w:num>
   <w:num w:numId="1038">
-    <w:abstractNumId w:val="991"/>
+    <w:abstractNumId w:val="99411"/>
+    <w:lvlOverride w:ilvl="0">
+      <w:startOverride w:val="1"/>
+    </w:lvlOverride>
+    <w:lvlOverride w:ilvl="1">
+      <w:startOverride w:val="1"/>
+    </w:lvlOverride>
+    <w:lvlOverride w:ilvl="2">
+      <w:startOverride w:val="1"/>
+    </w:lvlOverride>
+    <w:lvlOverride w:ilvl="3">
+      <w:startOverride w:val="1"/>
+    </w:lvlOverride>
+    <w:lvlOverride w:ilvl="4">
+      <w:startOverride w:val="1"/>
+    </w:lvlOverride>
+    <w:lvlOverride w:ilvl="5">
+      <w:startOverride w:val="1"/>
+    </w:lvlOverride>
+    <w:lvlOverride w:ilvl="6">
+      <w:startOverride w:val="1"/>
+    </w:lvlOverride>
+    <w:lvlOverride w:ilvl="7">
+      <w:startOverride w:val="1"/>
+    </w:lvlOverride>
+    <w:lvlOverride w:ilvl="8">
+      <w:startOverride w:val="1"/>
+    </w:lvlOverride>
   </w:num>
   <w:num w:numId="1039">
     <w:abstractNumId w:val="991"/>
   </w:num>
   <w:num w:numId="1040">
+    <w:abstractNumId w:val="991"/>
+  </w:num>
+  <w:num w:numId="1041">
+    <w:abstractNumId w:val="99411"/>
+    <w:lvlOverride w:ilvl="0">
+      <w:startOverride w:val="1"/>
+    </w:lvlOverride>
+    <w:lvlOverride w:ilvl="1">
+      <w:startOverride w:val="1"/>
+    </w:lvlOverride>
+    <w:lvlOverride w:ilvl="2">
+      <w:startOverride w:val="1"/>
+    </w:lvlOverride>
+    <w:lvlOverride w:ilvl="3">
+      <w:startOverride w:val="1"/>
+    </w:lvlOverride>
+    <w:lvlOverride w:ilvl="4">
+      <w:startOverride w:val="1"/>
+    </w:lvlOverride>
+    <w:lvlOverride w:ilvl="5">
+      <w:startOverride w:val="1"/>
+    </w:lvlOverride>
+    <w:lvlOverride w:ilvl="6">
+      <w:startOverride w:val="1"/>
+    </w:lvlOverride>
+    <w:lvlOverride w:ilvl="7">
+      <w:startOverride w:val="1"/>
+    </w:lvlOverride>
+    <w:lvlOverride w:ilvl="8">
+      <w:startOverride w:val="1"/>
+    </w:lvlOverride>
+  </w:num>
+  <w:num w:numId="1042">
+    <w:abstractNumId w:val="991"/>
+  </w:num>
+  <w:num w:numId="1043">
+    <w:abstractNumId w:val="991"/>
+  </w:num>
+  <w:num w:numId="1044">
     <w:abstractNumId w:val="991"/>
   </w:num>
 </w:numbering>

</xml_diff>